<commit_message>
add script to do EDA
</commit_message>
<xml_diff>
--- a/Berkas Skripsi/Buku Skripsi.docx
+++ b/Berkas Skripsi/Buku Skripsi.docx
@@ -13921,6 +13921,27 @@
       <w:r>
         <w:lastRenderedPageBreak/>
         <w:t>ANALISIS DAN DESAIN</w:t>
+      </w:r>
+    </w:p>
+    <w:p/>
+    <w:p>
+      <w:pPr>
+        <w:pStyle w:val="Heading2"/>
+      </w:pPr>
+      <w:r>
+        <w:t>Analisis Permasalahan</w:t>
+      </w:r>
+    </w:p>
+    <w:p/>
+    <w:p>
+      <w:pPr>
+        <w:pStyle w:val="Heading2"/>
+      </w:pPr>
+      <w:r>
+        <w:t xml:space="preserve">Analisis </w:t>
+      </w:r>
+      <w:r>
+        <w:t>Kebutuhan</w:t>
       </w:r>
     </w:p>
     <w:p/>

</xml_diff>

<commit_message>
finalize the data, preprocess it and save the result on folder 2
</commit_message>
<xml_diff>
--- a/Berkas Skripsi/Buku Skripsi.docx
+++ b/Berkas Skripsi/Buku Skripsi.docx
@@ -7327,43 +7327,7 @@
           <w:sz w:val="22"/>
           <w:szCs w:val="22"/>
         </w:rPr>
-        <w:t xml:space="preserve">(Perdana </w:t>
-      </w:r>
-      <w:proofErr w:type="spellStart"/>
-      <w:r>
-        <w:rPr>
-          <w:rFonts w:asciiTheme="minorHAnsi" w:hAnsiTheme="minorHAnsi" w:cstheme="minorHAnsi"/>
-          <w:sz w:val="22"/>
-          <w:szCs w:val="22"/>
-        </w:rPr>
-        <w:t>et</w:t>
-      </w:r>
-      <w:proofErr w:type="spellEnd"/>
-      <w:r>
-        <w:rPr>
-          <w:rFonts w:asciiTheme="minorHAnsi" w:hAnsiTheme="minorHAnsi" w:cstheme="minorHAnsi"/>
-          <w:sz w:val="22"/>
-          <w:szCs w:val="22"/>
-        </w:rPr>
-        <w:t xml:space="preserve"> </w:t>
-      </w:r>
-      <w:proofErr w:type="spellStart"/>
-      <w:r>
-        <w:rPr>
-          <w:rFonts w:asciiTheme="minorHAnsi" w:hAnsiTheme="minorHAnsi" w:cstheme="minorHAnsi"/>
-          <w:sz w:val="22"/>
-          <w:szCs w:val="22"/>
-        </w:rPr>
-        <w:t>al.</w:t>
-      </w:r>
-      <w:proofErr w:type="spellEnd"/>
-      <w:r>
-        <w:rPr>
-          <w:rFonts w:asciiTheme="minorHAnsi" w:hAnsiTheme="minorHAnsi" w:cstheme="minorHAnsi"/>
-          <w:sz w:val="22"/>
-          <w:szCs w:val="22"/>
-        </w:rPr>
-        <w:t>, 2024)</w:t>
+        <w:t>(Perdana et al., 2024)</w:t>
       </w:r>
       <w:r>
         <w:rPr>
@@ -10184,39 +10148,7 @@
           <w:rFonts w:ascii="Calibri" w:hAnsi="Calibri" w:cs="Calibri"/>
           <w:sz w:val="22"/>
         </w:rPr>
-        <w:t xml:space="preserve">(Perdana </w:t>
-      </w:r>
-      <w:proofErr w:type="spellStart"/>
-      <w:r>
-        <w:rPr>
-          <w:rFonts w:ascii="Calibri" w:hAnsi="Calibri" w:cs="Calibri"/>
-          <w:sz w:val="22"/>
-        </w:rPr>
-        <w:t>et</w:t>
-      </w:r>
-      <w:proofErr w:type="spellEnd"/>
-      <w:r>
-        <w:rPr>
-          <w:rFonts w:ascii="Calibri" w:hAnsi="Calibri" w:cs="Calibri"/>
-          <w:sz w:val="22"/>
-        </w:rPr>
-        <w:t xml:space="preserve"> </w:t>
-      </w:r>
-      <w:proofErr w:type="spellStart"/>
-      <w:r>
-        <w:rPr>
-          <w:rFonts w:ascii="Calibri" w:hAnsi="Calibri" w:cs="Calibri"/>
-          <w:sz w:val="22"/>
-        </w:rPr>
-        <w:t>al.</w:t>
-      </w:r>
-      <w:proofErr w:type="spellEnd"/>
-      <w:r>
-        <w:rPr>
-          <w:rFonts w:ascii="Calibri" w:hAnsi="Calibri" w:cs="Calibri"/>
-          <w:sz w:val="22"/>
-        </w:rPr>
-        <w:t>, 2024)</w:t>
+        <w:t>(Perdana et al., 2024)</w:t>
       </w:r>
       <w:r>
         <w:rPr>
@@ -13338,7 +13270,6 @@
         </w:rPr>
         <w:t>(</w:t>
       </w:r>
-      <w:proofErr w:type="spellStart"/>
       <w:r>
         <w:rPr>
           <w:rFonts w:asciiTheme="minorHAnsi" w:hAnsiTheme="minorHAnsi" w:cstheme="minorHAnsi"/>
@@ -13347,18 +13278,7 @@
           <w:sz w:val="22"/>
           <w:szCs w:val="22"/>
         </w:rPr>
-        <w:t>Casino</w:t>
-      </w:r>
-      <w:proofErr w:type="spellEnd"/>
-      <w:r>
-        <w:rPr>
-          <w:rFonts w:asciiTheme="minorHAnsi" w:hAnsiTheme="minorHAnsi" w:cstheme="minorHAnsi"/>
-          <w:i/>
-          <w:iCs/>
-          <w:sz w:val="22"/>
-          <w:szCs w:val="22"/>
-        </w:rPr>
-        <w:t xml:space="preserve"> &amp; Gambling Glossary - Glossary of Gambling Terms</w:t>
+        <w:t>Casino &amp; Gambling Glossary - Glossary of Gambling Terms</w:t>
       </w:r>
       <w:r>
         <w:rPr>
@@ -20075,6 +19995,8 @@
       <w:r>
         <w:rPr>
           <w:rFonts w:asciiTheme="minorHAnsi" w:hAnsiTheme="minorHAnsi" w:cstheme="minorHAnsi"/>
+          <w:i/>
+          <w:iCs/>
           <w:sz w:val="22"/>
           <w:szCs w:val="22"/>
         </w:rPr>
@@ -20093,6 +20015,8 @@
       <w:r>
         <w:rPr>
           <w:rFonts w:asciiTheme="minorHAnsi" w:hAnsiTheme="minorHAnsi" w:cstheme="minorHAnsi"/>
+          <w:i/>
+          <w:iCs/>
           <w:sz w:val="22"/>
           <w:szCs w:val="22"/>
         </w:rPr>
@@ -20302,6 +20226,8 @@
       <w:r>
         <w:rPr>
           <w:rFonts w:asciiTheme="minorHAnsi" w:hAnsiTheme="minorHAnsi" w:cstheme="minorHAnsi"/>
+          <w:i/>
+          <w:iCs/>
           <w:sz w:val="22"/>
           <w:szCs w:val="22"/>
           <w:lang w:val="id-ID"/>
@@ -20312,6 +20238,8 @@
       <w:r>
         <w:rPr>
           <w:rFonts w:asciiTheme="minorHAnsi" w:hAnsiTheme="minorHAnsi" w:cstheme="minorHAnsi"/>
+          <w:i/>
+          <w:iCs/>
           <w:sz w:val="22"/>
           <w:szCs w:val="22"/>
           <w:lang w:val="id-ID"/>
@@ -20322,6 +20250,8 @@
       <w:r>
         <w:rPr>
           <w:rFonts w:asciiTheme="minorHAnsi" w:hAnsiTheme="minorHAnsi" w:cstheme="minorHAnsi"/>
+          <w:i/>
+          <w:iCs/>
           <w:sz w:val="22"/>
           <w:szCs w:val="22"/>
           <w:lang w:val="id-ID"/>
@@ -20362,6 +20292,8 @@
       <w:r>
         <w:rPr>
           <w:rFonts w:asciiTheme="minorHAnsi" w:hAnsiTheme="minorHAnsi" w:cstheme="minorHAnsi"/>
+          <w:i/>
+          <w:iCs/>
           <w:sz w:val="22"/>
           <w:szCs w:val="22"/>
           <w:lang w:val="id-ID"/>
@@ -21687,7 +21619,7 @@
           <w:sz w:val="22"/>
           <w:szCs w:val="22"/>
         </w:rPr>
-        <w:t>termasuk pembersihan teks, penghapusan duplikat, serta normalisasi sederhana</w:t>
+        <w:t>termasuk</w:t>
       </w:r>
       <w:r>
         <w:rPr>
@@ -21703,7 +21635,7 @@
           <w:sz w:val="22"/>
           <w:szCs w:val="22"/>
         </w:rPr>
-        <w:t>jumlah data berlabel yang tersedia untuk analisis dan eksperimen menjadi 11.825 teks.</w:t>
+        <w:t>pembersihan teks, penghapusan duplikat, serta normalisasi sederhana</w:t>
       </w:r>
       <w:r>
         <w:rPr>
@@ -21719,6 +21651,172 @@
           <w:sz w:val="22"/>
           <w:szCs w:val="22"/>
         </w:rPr>
+        <w:t xml:space="preserve">jumlah data berlabel yang tersedia untuk analisis dan eksperimen menjadi </w:t>
+      </w:r>
+      <w:r>
+        <w:rPr>
+          <w:rFonts w:asciiTheme="minorHAnsi" w:hAnsiTheme="minorHAnsi" w:cstheme="minorHAnsi"/>
+          <w:sz w:val="22"/>
+          <w:szCs w:val="22"/>
+        </w:rPr>
+        <w:t>12.058</w:t>
+      </w:r>
+      <w:r>
+        <w:rPr>
+          <w:rFonts w:asciiTheme="minorHAnsi" w:hAnsiTheme="minorHAnsi" w:cstheme="minorHAnsi"/>
+          <w:sz w:val="22"/>
+          <w:szCs w:val="22"/>
+        </w:rPr>
+        <w:t xml:space="preserve"> teks.</w:t>
+      </w:r>
+      <w:r>
+        <w:rPr>
+          <w:rFonts w:asciiTheme="minorHAnsi" w:hAnsiTheme="minorHAnsi" w:cstheme="minorHAnsi"/>
+          <w:sz w:val="22"/>
+          <w:szCs w:val="22"/>
+        </w:rPr>
+        <w:t xml:space="preserve"> </w:t>
+      </w:r>
+      <w:r>
+        <w:rPr>
+          <w:rFonts w:asciiTheme="minorHAnsi" w:hAnsiTheme="minorHAnsi" w:cstheme="minorHAnsi"/>
+          <w:sz w:val="22"/>
+          <w:szCs w:val="22"/>
+        </w:rPr>
+        <w:t xml:space="preserve">Dari keseluruhan data tersebut, 10.355 teks </w:t>
+      </w:r>
+      <w:proofErr w:type="spellStart"/>
+      <w:r>
+        <w:rPr>
+          <w:rFonts w:asciiTheme="minorHAnsi" w:hAnsiTheme="minorHAnsi" w:cstheme="minorHAnsi"/>
+          <w:sz w:val="22"/>
+          <w:szCs w:val="22"/>
+        </w:rPr>
+        <w:t>divoting</w:t>
+      </w:r>
+      <w:proofErr w:type="spellEnd"/>
+      <w:r>
+        <w:rPr>
+          <w:rFonts w:asciiTheme="minorHAnsi" w:hAnsiTheme="minorHAnsi" w:cstheme="minorHAnsi"/>
+          <w:sz w:val="22"/>
+          <w:szCs w:val="22"/>
+        </w:rPr>
+        <w:t xml:space="preserve"> oleh 3 orang </w:t>
+      </w:r>
+      <w:proofErr w:type="spellStart"/>
+      <w:r>
+        <w:rPr>
+          <w:rFonts w:asciiTheme="minorHAnsi" w:hAnsiTheme="minorHAnsi" w:cstheme="minorHAnsi"/>
+          <w:i/>
+          <w:iCs/>
+          <w:sz w:val="22"/>
+          <w:szCs w:val="22"/>
+        </w:rPr>
+        <w:t>annotator</w:t>
+      </w:r>
+      <w:proofErr w:type="spellEnd"/>
+      <w:r>
+        <w:rPr>
+          <w:rFonts w:asciiTheme="minorHAnsi" w:hAnsiTheme="minorHAnsi" w:cstheme="minorHAnsi"/>
+          <w:sz w:val="22"/>
+          <w:szCs w:val="22"/>
+        </w:rPr>
+        <w:t xml:space="preserve">, 1.719 teks </w:t>
+      </w:r>
+      <w:proofErr w:type="spellStart"/>
+      <w:r>
+        <w:rPr>
+          <w:rFonts w:asciiTheme="minorHAnsi" w:hAnsiTheme="minorHAnsi" w:cstheme="minorHAnsi"/>
+          <w:sz w:val="22"/>
+          <w:szCs w:val="22"/>
+        </w:rPr>
+        <w:t>divoting</w:t>
+      </w:r>
+      <w:proofErr w:type="spellEnd"/>
+      <w:r>
+        <w:rPr>
+          <w:rFonts w:asciiTheme="minorHAnsi" w:hAnsiTheme="minorHAnsi" w:cstheme="minorHAnsi"/>
+          <w:sz w:val="22"/>
+          <w:szCs w:val="22"/>
+        </w:rPr>
+        <w:t xml:space="preserve"> oleh 4 orang </w:t>
+      </w:r>
+      <w:proofErr w:type="spellStart"/>
+      <w:r>
+        <w:rPr>
+          <w:rFonts w:asciiTheme="minorHAnsi" w:hAnsiTheme="minorHAnsi" w:cstheme="minorHAnsi"/>
+          <w:i/>
+          <w:iCs/>
+          <w:sz w:val="22"/>
+          <w:szCs w:val="22"/>
+        </w:rPr>
+        <w:t>annotator</w:t>
+      </w:r>
+      <w:proofErr w:type="spellEnd"/>
+      <w:r>
+        <w:rPr>
+          <w:rFonts w:asciiTheme="minorHAnsi" w:hAnsiTheme="minorHAnsi" w:cstheme="minorHAnsi"/>
+          <w:sz w:val="22"/>
+          <w:szCs w:val="22"/>
+        </w:rPr>
+        <w:t xml:space="preserve">, dan 39 teks </w:t>
+      </w:r>
+      <w:proofErr w:type="spellStart"/>
+      <w:r>
+        <w:rPr>
+          <w:rFonts w:asciiTheme="minorHAnsi" w:hAnsiTheme="minorHAnsi" w:cstheme="minorHAnsi"/>
+          <w:sz w:val="22"/>
+          <w:szCs w:val="22"/>
+        </w:rPr>
+        <w:t>divoting</w:t>
+      </w:r>
+      <w:proofErr w:type="spellEnd"/>
+      <w:r>
+        <w:rPr>
+          <w:rFonts w:asciiTheme="minorHAnsi" w:hAnsiTheme="minorHAnsi" w:cstheme="minorHAnsi"/>
+          <w:sz w:val="22"/>
+          <w:szCs w:val="22"/>
+        </w:rPr>
+        <w:t xml:space="preserve"> oleh 5 orang </w:t>
+      </w:r>
+      <w:proofErr w:type="spellStart"/>
+      <w:r>
+        <w:rPr>
+          <w:rFonts w:asciiTheme="minorHAnsi" w:hAnsiTheme="minorHAnsi" w:cstheme="minorHAnsi"/>
+          <w:i/>
+          <w:iCs/>
+          <w:sz w:val="22"/>
+          <w:szCs w:val="22"/>
+        </w:rPr>
+        <w:t>annotator</w:t>
+      </w:r>
+      <w:proofErr w:type="spellEnd"/>
+      <w:r>
+        <w:rPr>
+          <w:rFonts w:asciiTheme="minorHAnsi" w:hAnsiTheme="minorHAnsi" w:cstheme="minorHAnsi"/>
+          <w:sz w:val="22"/>
+          <w:szCs w:val="22"/>
+        </w:rPr>
+        <w:t>.</w:t>
+      </w:r>
+    </w:p>
+    <w:p>
+      <w:pPr>
+        <w:spacing w:line="360" w:lineRule="auto"/>
+        <w:ind w:firstLine="567"/>
+        <w:jc w:val="both"/>
+        <w:rPr>
+          <w:rFonts w:asciiTheme="minorHAnsi" w:hAnsiTheme="minorHAnsi" w:cstheme="minorHAnsi"/>
+          <w:sz w:val="22"/>
+          <w:szCs w:val="22"/>
+        </w:rPr>
+      </w:pPr>
+      <w:r>
+        <w:rPr>
+          <w:rFonts w:asciiTheme="minorHAnsi" w:hAnsiTheme="minorHAnsi" w:cstheme="minorHAnsi"/>
+          <w:sz w:val="22"/>
+          <w:szCs w:val="22"/>
+        </w:rPr>
         <w:t>P</w:t>
       </w:r>
       <w:r>
@@ -21759,7 +21857,39 @@
           <w:sz w:val="22"/>
           <w:szCs w:val="22"/>
         </w:rPr>
-        <w:t>mana data terbagi seimbang menjadi 6.083 teks promosi (label positif) dan 5.742 teks</w:t>
+        <w:t>mana data terbagi seimbang menjadi 6.</w:t>
+      </w:r>
+      <w:r>
+        <w:rPr>
+          <w:rFonts w:asciiTheme="minorHAnsi" w:hAnsiTheme="minorHAnsi" w:cstheme="minorHAnsi"/>
+          <w:sz w:val="22"/>
+          <w:szCs w:val="22"/>
+        </w:rPr>
+        <w:t>229</w:t>
+      </w:r>
+      <w:r>
+        <w:rPr>
+          <w:rFonts w:asciiTheme="minorHAnsi" w:hAnsiTheme="minorHAnsi" w:cstheme="minorHAnsi"/>
+          <w:sz w:val="22"/>
+          <w:szCs w:val="22"/>
+        </w:rPr>
+        <w:t xml:space="preserve"> teks promosi (label positif) dan 5.</w:t>
+      </w:r>
+      <w:r>
+        <w:rPr>
+          <w:rFonts w:asciiTheme="minorHAnsi" w:hAnsiTheme="minorHAnsi" w:cstheme="minorHAnsi"/>
+          <w:sz w:val="22"/>
+          <w:szCs w:val="22"/>
+        </w:rPr>
+        <w:t>829</w:t>
+      </w:r>
+      <w:r>
+        <w:rPr>
+          <w:rFonts w:asciiTheme="minorHAnsi" w:hAnsiTheme="minorHAnsi" w:cstheme="minorHAnsi"/>
+          <w:sz w:val="22"/>
+          <w:szCs w:val="22"/>
+        </w:rPr>
+        <w:t xml:space="preserve"> teks</w:t>
       </w:r>
       <w:r>
         <w:rPr>
@@ -21835,17 +21965,14 @@
       </w:pPr>
       <w:r>
         <w:rPr>
-          <w:rFonts w:asciiTheme="minorHAnsi" w:hAnsiTheme="minorHAnsi" w:cstheme="minorHAnsi"/>
           <w:noProof/>
-          <w:sz w:val="22"/>
-          <w:szCs w:val="22"/>
         </w:rPr>
         <w:lastRenderedPageBreak/>
         <w:drawing>
-          <wp:inline distT="0" distB="0" distL="0" distR="0" wp14:anchorId="00FC3FDA" wp14:editId="0DF70B20">
-            <wp:extent cx="3947160" cy="3096367"/>
-            <wp:effectExtent l="0" t="0" r="0" b="8890"/>
-            <wp:docPr id="1832465548" name="Picture 1"/>
+          <wp:inline distT="0" distB="0" distL="0" distR="0" wp14:anchorId="77020853" wp14:editId="315EF74E">
+            <wp:extent cx="3373323" cy="2646218"/>
+            <wp:effectExtent l="0" t="0" r="0" b="1905"/>
+            <wp:docPr id="2127780249" name="Picture 1"/>
             <wp:cNvGraphicFramePr>
               <a:graphicFrameLocks xmlns:a="http://schemas.openxmlformats.org/drawingml/2006/main" noChangeAspect="1"/>
             </wp:cNvGraphicFramePr>
@@ -21853,7 +21980,7 @@
               <a:graphicData uri="http://schemas.openxmlformats.org/drawingml/2006/picture">
                 <pic:pic xmlns:pic="http://schemas.openxmlformats.org/drawingml/2006/picture">
                   <pic:nvPicPr>
-                    <pic:cNvPr id="1832465548" name=""/>
+                    <pic:cNvPr id="2127780249" name=""/>
                     <pic:cNvPicPr/>
                   </pic:nvPicPr>
                   <pic:blipFill>
@@ -21865,7 +21992,7 @@
                   <pic:spPr>
                     <a:xfrm>
                       <a:off x="0" y="0"/>
-                      <a:ext cx="3957259" cy="3104289"/>
+                      <a:ext cx="3382280" cy="2653244"/>
                     </a:xfrm>
                     <a:prstGeom prst="rect">
                       <a:avLst/>
@@ -22095,14 +22222,13 @@
       <w:r>
         <w:rPr>
           <w:noProof/>
-          <w14:ligatures w14:val="standardContextual"/>
         </w:rPr>
         <w:lastRenderedPageBreak/>
         <w:drawing>
-          <wp:inline distT="0" distB="0" distL="0" distR="0" wp14:anchorId="3CB9AC86" wp14:editId="56F24293">
-            <wp:extent cx="5400040" cy="2912745"/>
-            <wp:effectExtent l="0" t="0" r="0" b="1905"/>
-            <wp:docPr id="780510462" name="Picture 1"/>
+          <wp:inline distT="0" distB="0" distL="0" distR="0" wp14:anchorId="0DB62586" wp14:editId="467A35BC">
+            <wp:extent cx="5400040" cy="2682240"/>
+            <wp:effectExtent l="0" t="0" r="0" b="3810"/>
+            <wp:docPr id="1090613796" name="Picture 1"/>
             <wp:cNvGraphicFramePr>
               <a:graphicFrameLocks xmlns:a="http://schemas.openxmlformats.org/drawingml/2006/main" noChangeAspect="1"/>
             </wp:cNvGraphicFramePr>
@@ -22110,7 +22236,7 @@
               <a:graphicData uri="http://schemas.openxmlformats.org/drawingml/2006/picture">
                 <pic:pic xmlns:pic="http://schemas.openxmlformats.org/drawingml/2006/picture">
                   <pic:nvPicPr>
-                    <pic:cNvPr id="780510462" name=""/>
+                    <pic:cNvPr id="1090613796" name=""/>
                     <pic:cNvPicPr/>
                   </pic:nvPicPr>
                   <pic:blipFill>
@@ -22122,7 +22248,7 @@
                   <pic:spPr>
                     <a:xfrm>
                       <a:off x="0" y="0"/>
-                      <a:ext cx="5400040" cy="2912745"/>
+                      <a:ext cx="5400040" cy="2682240"/>
                     </a:xfrm>
                     <a:prstGeom prst="rect">
                       <a:avLst/>
@@ -23046,10 +23172,10 @@
           <w:noProof/>
         </w:rPr>
         <w:drawing>
-          <wp:inline distT="0" distB="0" distL="0" distR="0" wp14:anchorId="43363B79" wp14:editId="02870603">
+          <wp:inline distT="0" distB="0" distL="0" distR="0" wp14:anchorId="44E4FAC2" wp14:editId="58E7E899">
             <wp:extent cx="5400040" cy="3337560"/>
             <wp:effectExtent l="0" t="0" r="0" b="0"/>
-            <wp:docPr id="192640664" name="Picture 1"/>
+            <wp:docPr id="968730513" name="Picture 1"/>
             <wp:cNvGraphicFramePr>
               <a:graphicFrameLocks xmlns:a="http://schemas.openxmlformats.org/drawingml/2006/main" noChangeAspect="1"/>
             </wp:cNvGraphicFramePr>
@@ -23057,7 +23183,7 @@
               <a:graphicData uri="http://schemas.openxmlformats.org/drawingml/2006/picture">
                 <pic:pic xmlns:pic="http://schemas.openxmlformats.org/drawingml/2006/picture">
                   <pic:nvPicPr>
-                    <pic:cNvPr id="192640664" name=""/>
+                    <pic:cNvPr id="968730513" name=""/>
                     <pic:cNvPicPr/>
                   </pic:nvPicPr>
                   <pic:blipFill>
@@ -23465,16 +23591,13 @@
       </w:pPr>
       <w:r>
         <w:rPr>
-          <w:rFonts w:asciiTheme="minorHAnsi" w:hAnsiTheme="minorHAnsi" w:cstheme="minorHAnsi"/>
           <w:noProof/>
-          <w:sz w:val="22"/>
-          <w:szCs w:val="22"/>
         </w:rPr>
         <w:drawing>
-          <wp:inline distT="0" distB="0" distL="0" distR="0" wp14:anchorId="3A6D5346" wp14:editId="61351716">
-            <wp:extent cx="5400040" cy="3368040"/>
-            <wp:effectExtent l="0" t="0" r="0" b="3810"/>
-            <wp:docPr id="1291998861" name="Picture 1"/>
+          <wp:inline distT="0" distB="0" distL="0" distR="0" wp14:anchorId="0FABF7CB" wp14:editId="40582286">
+            <wp:extent cx="5400040" cy="3375660"/>
+            <wp:effectExtent l="0" t="0" r="0" b="0"/>
+            <wp:docPr id="711903387" name="Picture 1"/>
             <wp:cNvGraphicFramePr>
               <a:graphicFrameLocks xmlns:a="http://schemas.openxmlformats.org/drawingml/2006/main" noChangeAspect="1"/>
             </wp:cNvGraphicFramePr>
@@ -23482,7 +23605,7 @@
               <a:graphicData uri="http://schemas.openxmlformats.org/drawingml/2006/picture">
                 <pic:pic xmlns:pic="http://schemas.openxmlformats.org/drawingml/2006/picture">
                   <pic:nvPicPr>
-                    <pic:cNvPr id="1291998861" name=""/>
+                    <pic:cNvPr id="711903387" name=""/>
                     <pic:cNvPicPr/>
                   </pic:nvPicPr>
                   <pic:blipFill>
@@ -23494,7 +23617,7 @@
                   <pic:spPr>
                     <a:xfrm>
                       <a:off x="0" y="0"/>
-                      <a:ext cx="5400040" cy="3368040"/>
+                      <a:ext cx="5400040" cy="3375660"/>
                     </a:xfrm>
                     <a:prstGeom prst="rect">
                       <a:avLst/>
@@ -24136,7 +24259,7 @@
           <w:noProof/>
         </w:rPr>
         <w:drawing>
-          <wp:anchor distT="0" distB="0" distL="114300" distR="114300" simplePos="0" relativeHeight="251662336" behindDoc="0" locked="0" layoutInCell="1" allowOverlap="1" wp14:anchorId="6CE18FC7" wp14:editId="776BE88E">
+          <wp:anchor distT="0" distB="0" distL="114300" distR="114300" simplePos="0" relativeHeight="251662336" behindDoc="0" locked="0" layoutInCell="1" allowOverlap="1" wp14:anchorId="6CE18FC7" wp14:editId="76D383AB">
             <wp:simplePos x="0" y="0"/>
             <wp:positionH relativeFrom="column">
               <wp:posOffset>2822575</wp:posOffset>
@@ -24196,7 +24319,7 @@
           <w:noProof/>
         </w:rPr>
         <w:drawing>
-          <wp:inline distT="0" distB="0" distL="0" distR="0" wp14:anchorId="25AB6F1C" wp14:editId="1E09C233">
+          <wp:inline distT="0" distB="0" distL="0" distR="0" wp14:anchorId="25AB6F1C" wp14:editId="4F01101A">
             <wp:extent cx="1638000" cy="5040000"/>
             <wp:effectExtent l="0" t="0" r="635" b="8255"/>
             <wp:docPr id="38900143" name="Picture 5"/>
@@ -26043,13 +26166,10 @@
           </w:tcPr>
           <w:p>
             <w:pPr>
-              <w:jc w:val="both"/>
-              <w:rPr>
-                <w:rFonts w:ascii="Calibri" w:eastAsia="Times New Roman" w:hAnsi="Calibri" w:cs="Calibri"/>
-                <w:color w:val="000000"/>
+              <w:rPr>
+                <w:rFonts w:asciiTheme="minorHAnsi" w:hAnsiTheme="minorHAnsi" w:cstheme="minorHAnsi"/>
                 <w:sz w:val="18"/>
                 <w:szCs w:val="18"/>
-                <w:lang w:val="en-ID" w:eastAsia="en-ID"/>
               </w:rPr>
             </w:pPr>
             <w:r>
@@ -26059,7 +26179,7 @@
                 <w:sz w:val="18"/>
                 <w:szCs w:val="18"/>
               </w:rPr>
-              <w:t xml:space="preserve">Infonya </w:t>
+              <w:t xml:space="preserve">Beritahu saja mumpung masih bagus, masukkan saja ke dalam </w:t>
             </w:r>
             <w:proofErr w:type="spellStart"/>
             <w:r>
@@ -26069,7 +26189,7 @@
                 <w:sz w:val="18"/>
                 <w:szCs w:val="18"/>
               </w:rPr>
-              <w:t>aja</w:t>
+              <w:t>jepe</w:t>
             </w:r>
             <w:proofErr w:type="spellEnd"/>
             <w:r>
@@ -26079,7 +26199,7 @@
                 <w:sz w:val="18"/>
                 <w:szCs w:val="18"/>
               </w:rPr>
-              <w:t xml:space="preserve"> mumpung masih bagus, kasih </w:t>
+              <w:t xml:space="preserve"> besar </w:t>
             </w:r>
             <w:proofErr w:type="spellStart"/>
             <w:r>
@@ -26089,7 +26209,7 @@
                 <w:sz w:val="18"/>
                 <w:szCs w:val="18"/>
               </w:rPr>
-              <w:t>aja</w:t>
+              <w:t>gacor</w:t>
             </w:r>
             <w:proofErr w:type="spellEnd"/>
             <w:r>
@@ -26099,79 +26219,8 @@
                 <w:sz w:val="18"/>
                 <w:szCs w:val="18"/>
               </w:rPr>
-              <w:t xml:space="preserve"> ke </w:t>
-            </w:r>
-            <w:proofErr w:type="spellStart"/>
-            <w:r>
-              <w:rPr>
-                <w:rFonts w:ascii="Calibri" w:hAnsi="Calibri" w:cs="Calibri"/>
-                <w:color w:val="000000"/>
-                <w:sz w:val="18"/>
-                <w:szCs w:val="18"/>
-              </w:rPr>
-              <w:t>link</w:t>
-            </w:r>
-            <w:proofErr w:type="spellEnd"/>
-            <w:r>
-              <w:rPr>
-                <w:rFonts w:ascii="Calibri" w:hAnsi="Calibri" w:cs="Calibri"/>
-                <w:color w:val="000000"/>
-                <w:sz w:val="18"/>
-                <w:szCs w:val="18"/>
-              </w:rPr>
-              <w:t xml:space="preserve"> </w:t>
-            </w:r>
-            <w:proofErr w:type="spellStart"/>
-            <w:r>
-              <w:rPr>
-                <w:rFonts w:ascii="Calibri" w:hAnsi="Calibri" w:cs="Calibri"/>
-                <w:color w:val="000000"/>
-                <w:sz w:val="18"/>
-                <w:szCs w:val="18"/>
-              </w:rPr>
-              <w:t>jepe</w:t>
-            </w:r>
-            <w:proofErr w:type="spellEnd"/>
-            <w:r>
-              <w:rPr>
-                <w:rFonts w:ascii="Calibri" w:hAnsi="Calibri" w:cs="Calibri"/>
-                <w:color w:val="000000"/>
-                <w:sz w:val="18"/>
-                <w:szCs w:val="18"/>
-              </w:rPr>
-              <w:t xml:space="preserve"> </w:t>
-            </w:r>
-            <w:proofErr w:type="spellStart"/>
-            <w:r>
-              <w:rPr>
-                <w:rFonts w:ascii="Calibri" w:hAnsi="Calibri" w:cs="Calibri"/>
-                <w:color w:val="000000"/>
-                <w:sz w:val="18"/>
-                <w:szCs w:val="18"/>
-              </w:rPr>
-              <w:t>gacor</w:t>
-            </w:r>
-            <w:proofErr w:type="spellEnd"/>
-            <w:r>
-              <w:rPr>
-                <w:rFonts w:ascii="Calibri" w:hAnsi="Calibri" w:cs="Calibri"/>
-                <w:color w:val="000000"/>
-                <w:sz w:val="18"/>
-                <w:szCs w:val="18"/>
-              </w:rPr>
-              <w:t xml:space="preserve"> besar SAKAU007</w:t>
-            </w:r>
-          </w:p>
-          <w:p>
-            <w:pPr>
-              <w:spacing w:line="360" w:lineRule="auto"/>
-              <w:jc w:val="both"/>
-              <w:rPr>
-                <w:rFonts w:asciiTheme="minorHAnsi" w:hAnsiTheme="minorHAnsi" w:cstheme="minorHAnsi"/>
-                <w:sz w:val="18"/>
-                <w:szCs w:val="18"/>
-              </w:rPr>
-            </w:pPr>
+              <w:t xml:space="preserve"> linkakau007</w:t>
+            </w:r>
           </w:p>
         </w:tc>
       </w:tr>
@@ -26430,13 +26479,10 @@
           </w:tcPr>
           <w:p>
             <w:pPr>
-              <w:jc w:val="both"/>
-              <w:rPr>
-                <w:rFonts w:ascii="Calibri" w:eastAsia="Times New Roman" w:hAnsi="Calibri" w:cs="Calibri"/>
-                <w:color w:val="000000"/>
+              <w:rPr>
+                <w:rFonts w:asciiTheme="minorHAnsi" w:hAnsiTheme="minorHAnsi" w:cstheme="minorHAnsi"/>
                 <w:sz w:val="18"/>
                 <w:szCs w:val="18"/>
-                <w:lang w:val="en-ID" w:eastAsia="en-ID"/>
               </w:rPr>
             </w:pPr>
             <w:r>
@@ -26446,7 +26492,7 @@
                 <w:sz w:val="18"/>
                 <w:szCs w:val="18"/>
               </w:rPr>
-              <w:t xml:space="preserve">Saya kira isinya tidak sesuai ekspektasi, ternyata gila </w:t>
+              <w:t xml:space="preserve">Saya kira isinya tidak sesuai ekspektasi, ternyata gila banget </w:t>
             </w:r>
             <w:proofErr w:type="spellStart"/>
             <w:r>
@@ -26466,19 +26512,48 @@
                 <w:sz w:val="18"/>
                 <w:szCs w:val="18"/>
               </w:rPr>
-              <w:t>, coba saja kalau tidak percaya tqBONBON777</w:t>
-            </w:r>
-          </w:p>
-          <w:p>
-            <w:pPr>
-              <w:spacing w:line="360" w:lineRule="auto"/>
-              <w:jc w:val="both"/>
-              <w:rPr>
-                <w:rFonts w:asciiTheme="minorHAnsi" w:hAnsiTheme="minorHAnsi" w:cstheme="minorHAnsi"/>
+              <w:t xml:space="preserve">, coba </w:t>
+            </w:r>
+            <w:proofErr w:type="spellStart"/>
+            <w:r>
+              <w:rPr>
+                <w:rFonts w:ascii="Calibri" w:hAnsi="Calibri" w:cs="Calibri"/>
+                <w:color w:val="000000"/>
                 <w:sz w:val="18"/>
                 <w:szCs w:val="18"/>
               </w:rPr>
-            </w:pPr>
+              <w:t>aja</w:t>
+            </w:r>
+            <w:proofErr w:type="spellEnd"/>
+            <w:r>
+              <w:rPr>
+                <w:rFonts w:ascii="Calibri" w:hAnsi="Calibri" w:cs="Calibri"/>
+                <w:color w:val="000000"/>
+                <w:sz w:val="18"/>
+                <w:szCs w:val="18"/>
+              </w:rPr>
+              <w:t xml:space="preserve"> kalau </w:t>
+            </w:r>
+            <w:proofErr w:type="spellStart"/>
+            <w:r>
+              <w:rPr>
+                <w:rFonts w:ascii="Calibri" w:hAnsi="Calibri" w:cs="Calibri"/>
+                <w:color w:val="000000"/>
+                <w:sz w:val="18"/>
+                <w:szCs w:val="18"/>
+              </w:rPr>
+              <w:t>gak</w:t>
+            </w:r>
+            <w:proofErr w:type="spellEnd"/>
+            <w:r>
+              <w:rPr>
+                <w:rFonts w:ascii="Calibri" w:hAnsi="Calibri" w:cs="Calibri"/>
+                <w:color w:val="000000"/>
+                <w:sz w:val="18"/>
+                <w:szCs w:val="18"/>
+              </w:rPr>
+              <w:t xml:space="preserve"> percaya tqbonbon777</w:t>
+            </w:r>
           </w:p>
         </w:tc>
       </w:tr>
@@ -26640,6 +26715,7 @@
                 <w:szCs w:val="18"/>
               </w:rPr>
             </w:pPr>
+            <w:proofErr w:type="spellStart"/>
             <w:r>
               <w:rPr>
                 <w:rFonts w:ascii="Calibri" w:hAnsi="Calibri" w:cs="Calibri"/>
@@ -26647,7 +26723,77 @@
                 <w:sz w:val="18"/>
                 <w:szCs w:val="18"/>
               </w:rPr>
-              <w:t xml:space="preserve">Coba saja PG SOFT </w:t>
+              <w:t>Test</w:t>
+            </w:r>
+            <w:proofErr w:type="spellEnd"/>
+            <w:r>
+              <w:rPr>
+                <w:rFonts w:ascii="Calibri" w:hAnsi="Calibri" w:cs="Calibri"/>
+                <w:color w:val="000000"/>
+                <w:sz w:val="18"/>
+                <w:szCs w:val="18"/>
+              </w:rPr>
+              <w:t xml:space="preserve"> </w:t>
+            </w:r>
+            <w:proofErr w:type="spellStart"/>
+            <w:r>
+              <w:rPr>
+                <w:rFonts w:ascii="Calibri" w:hAnsi="Calibri" w:cs="Calibri"/>
+                <w:color w:val="000000"/>
+                <w:sz w:val="18"/>
+                <w:szCs w:val="18"/>
+              </w:rPr>
+              <w:t>aja</w:t>
+            </w:r>
+            <w:proofErr w:type="spellEnd"/>
+            <w:r>
+              <w:rPr>
+                <w:rFonts w:ascii="Calibri" w:hAnsi="Calibri" w:cs="Calibri"/>
+                <w:color w:val="000000"/>
+                <w:sz w:val="18"/>
+                <w:szCs w:val="18"/>
+              </w:rPr>
+              <w:t xml:space="preserve"> PG </w:t>
+            </w:r>
+            <w:proofErr w:type="spellStart"/>
+            <w:r>
+              <w:rPr>
+                <w:rFonts w:ascii="Calibri" w:hAnsi="Calibri" w:cs="Calibri"/>
+                <w:color w:val="000000"/>
+                <w:sz w:val="18"/>
+                <w:szCs w:val="18"/>
+              </w:rPr>
+              <w:t>Soft</w:t>
+            </w:r>
+            <w:proofErr w:type="spellEnd"/>
+            <w:r>
+              <w:rPr>
+                <w:rFonts w:ascii="Calibri" w:hAnsi="Calibri" w:cs="Calibri"/>
+                <w:color w:val="000000"/>
+                <w:sz w:val="18"/>
+                <w:szCs w:val="18"/>
+              </w:rPr>
+              <w:t xml:space="preserve"> </w:t>
+            </w:r>
+            <w:proofErr w:type="spellStart"/>
+            <w:r>
+              <w:rPr>
+                <w:rFonts w:ascii="Calibri" w:hAnsi="Calibri" w:cs="Calibri"/>
+                <w:color w:val="000000"/>
+                <w:sz w:val="18"/>
+                <w:szCs w:val="18"/>
+              </w:rPr>
+              <w:t>nya</w:t>
+            </w:r>
+            <w:proofErr w:type="spellEnd"/>
+            <w:r>
+              <w:rPr>
+                <w:rFonts w:ascii="Calibri" w:hAnsi="Calibri" w:cs="Calibri"/>
+                <w:color w:val="000000"/>
+                <w:sz w:val="18"/>
+                <w:szCs w:val="18"/>
+              </w:rPr>
+              <w:t xml:space="preserve"> </w:t>
             </w:r>
             <w:r>
               <w:rPr>
@@ -26685,7 +26831,7 @@
                 <w:sz w:val="18"/>
                 <w:szCs w:val="18"/>
               </w:rPr>
-              <w:t xml:space="preserve"> dan perkalian </w:t>
+              <w:t xml:space="preserve"> dan perkalian</w:t>
             </w:r>
           </w:p>
         </w:tc>
@@ -26847,13 +26993,25 @@
         </w:rPr>
         <w:t xml:space="preserve"> agar hanya kata-kata bermakna yang digunakan dalam perhitungan bobot TF-IDF. </w:t>
       </w:r>
-      <w:r>
-        <w:rPr>
-          <w:rFonts w:asciiTheme="minorHAnsi" w:hAnsiTheme="minorHAnsi" w:cstheme="minorHAnsi"/>
-          <w:sz w:val="22"/>
-          <w:szCs w:val="22"/>
-        </w:rPr>
-        <w:t xml:space="preserve">Hasil akhir dari rangkaian tahapan ini berupa teks bersih dan konsisten yang siap diubah menjadi representasi vektor numerik berbasis frekuensi kata. Contoh hasil akhir teks setelah </w:t>
+    </w:p>
+    <w:p>
+      <w:pPr>
+        <w:spacing w:line="360" w:lineRule="auto"/>
+        <w:ind w:firstLine="567"/>
+        <w:jc w:val="both"/>
+        <w:rPr>
+          <w:rFonts w:asciiTheme="minorHAnsi" w:hAnsiTheme="minorHAnsi" w:cstheme="minorHAnsi"/>
+          <w:sz w:val="22"/>
+          <w:szCs w:val="22"/>
+        </w:rPr>
+      </w:pPr>
+      <w:r>
+        <w:rPr>
+          <w:rFonts w:asciiTheme="minorHAnsi" w:hAnsiTheme="minorHAnsi" w:cstheme="minorHAnsi"/>
+          <w:sz w:val="22"/>
+          <w:szCs w:val="22"/>
+        </w:rPr>
+        <w:t xml:space="preserve">Sebagai langkah pembersihan akhir, dilakukan penghapusan data duplikat yang muncul kembali setelah seluruh tahapan </w:t>
       </w:r>
       <w:proofErr w:type="spellStart"/>
       <w:r>
@@ -26871,15 +27029,139 @@
           <w:sz w:val="22"/>
           <w:szCs w:val="22"/>
         </w:rPr>
+        <w:t xml:space="preserve"> untuk memastikan setiap teks bersifat unik dan bebas dari bias akibat pengulangan informasi. Proses ini menghasilkan total 10.993 teks yang siap digunakan untuk pelatihan model, terdiri atas 5.987 teks berlabel promosi (</w:t>
+      </w:r>
+      <w:proofErr w:type="spellStart"/>
+      <w:r>
+        <w:rPr>
+          <w:rFonts w:asciiTheme="minorHAnsi" w:hAnsiTheme="minorHAnsi" w:cstheme="minorHAnsi"/>
+          <w:sz w:val="22"/>
+          <w:szCs w:val="22"/>
+        </w:rPr>
+        <w:t>True</w:t>
+      </w:r>
+      <w:proofErr w:type="spellEnd"/>
+      <w:r>
+        <w:rPr>
+          <w:rFonts w:asciiTheme="minorHAnsi" w:hAnsiTheme="minorHAnsi" w:cstheme="minorHAnsi"/>
+          <w:sz w:val="22"/>
+          <w:szCs w:val="22"/>
+        </w:rPr>
+        <w:t>) dan 5.006 teks berlabel non-promosi (</w:t>
+      </w:r>
+      <w:proofErr w:type="spellStart"/>
+      <w:r>
+        <w:rPr>
+          <w:rFonts w:asciiTheme="minorHAnsi" w:hAnsiTheme="minorHAnsi" w:cstheme="minorHAnsi"/>
+          <w:sz w:val="22"/>
+          <w:szCs w:val="22"/>
+        </w:rPr>
+        <w:t>False</w:t>
+      </w:r>
+      <w:proofErr w:type="spellEnd"/>
+      <w:r>
+        <w:rPr>
+          <w:rFonts w:asciiTheme="minorHAnsi" w:hAnsiTheme="minorHAnsi" w:cstheme="minorHAnsi"/>
+          <w:sz w:val="22"/>
+          <w:szCs w:val="22"/>
+        </w:rPr>
+        <w:t>)</w:t>
+      </w:r>
+      <w:r>
+        <w:rPr>
+          <w:rFonts w:asciiTheme="minorHAnsi" w:hAnsiTheme="minorHAnsi" w:cstheme="minorHAnsi"/>
+          <w:sz w:val="22"/>
+          <w:szCs w:val="22"/>
+        </w:rPr>
+        <w:t xml:space="preserve"> d</w:t>
+      </w:r>
+      <w:r>
+        <w:rPr>
+          <w:rFonts w:asciiTheme="minorHAnsi" w:hAnsiTheme="minorHAnsi" w:cstheme="minorHAnsi"/>
+          <w:sz w:val="22"/>
+          <w:szCs w:val="22"/>
+        </w:rPr>
+        <w:t xml:space="preserve">engan distribusi antar kelas masih tergolong seimbang sehingga tidak diperlukan teknik </w:t>
+      </w:r>
+      <w:proofErr w:type="spellStart"/>
+      <w:r>
+        <w:rPr>
+          <w:rFonts w:asciiTheme="minorHAnsi" w:hAnsiTheme="minorHAnsi" w:cstheme="minorHAnsi"/>
+          <w:i/>
+          <w:iCs/>
+          <w:sz w:val="22"/>
+          <w:szCs w:val="22"/>
+        </w:rPr>
+        <w:t>resampling</w:t>
+      </w:r>
+      <w:proofErr w:type="spellEnd"/>
+      <w:r>
+        <w:rPr>
+          <w:rFonts w:asciiTheme="minorHAnsi" w:hAnsiTheme="minorHAnsi" w:cstheme="minorHAnsi"/>
+          <w:sz w:val="22"/>
+          <w:szCs w:val="22"/>
+        </w:rPr>
+        <w:t xml:space="preserve"> maupun </w:t>
+      </w:r>
+      <w:proofErr w:type="spellStart"/>
+      <w:r>
+        <w:rPr>
+          <w:rFonts w:asciiTheme="minorHAnsi" w:hAnsiTheme="minorHAnsi" w:cstheme="minorHAnsi"/>
+          <w:i/>
+          <w:iCs/>
+          <w:sz w:val="22"/>
+          <w:szCs w:val="22"/>
+        </w:rPr>
+        <w:t>class</w:t>
+      </w:r>
+      <w:proofErr w:type="spellEnd"/>
+      <w:r>
+        <w:rPr>
+          <w:rFonts w:asciiTheme="minorHAnsi" w:hAnsiTheme="minorHAnsi" w:cstheme="minorHAnsi"/>
+          <w:i/>
+          <w:iCs/>
+          <w:sz w:val="22"/>
+          <w:szCs w:val="22"/>
+        </w:rPr>
+        <w:t xml:space="preserve"> </w:t>
+      </w:r>
+      <w:proofErr w:type="spellStart"/>
+      <w:r>
+        <w:rPr>
+          <w:rFonts w:asciiTheme="minorHAnsi" w:hAnsiTheme="minorHAnsi" w:cstheme="minorHAnsi"/>
+          <w:i/>
+          <w:iCs/>
+          <w:sz w:val="22"/>
+          <w:szCs w:val="22"/>
+        </w:rPr>
+        <w:t>weighting</w:t>
+      </w:r>
+      <w:proofErr w:type="spellEnd"/>
+      <w:r>
+        <w:rPr>
+          <w:rFonts w:asciiTheme="minorHAnsi" w:hAnsiTheme="minorHAnsi" w:cstheme="minorHAnsi"/>
+          <w:sz w:val="22"/>
+          <w:szCs w:val="22"/>
+        </w:rPr>
+        <w:t xml:space="preserve"> tambahan pada tahap pelatihan. Contoh hasil akhir teks setelah </w:t>
+      </w:r>
+      <w:proofErr w:type="spellStart"/>
+      <w:r>
+        <w:rPr>
+          <w:rFonts w:asciiTheme="minorHAnsi" w:hAnsiTheme="minorHAnsi" w:cstheme="minorHAnsi"/>
+          <w:sz w:val="22"/>
+          <w:szCs w:val="22"/>
+        </w:rPr>
+        <w:t>preprocessing</w:t>
+      </w:r>
+      <w:proofErr w:type="spellEnd"/>
+      <w:r>
+        <w:rPr>
+          <w:rFonts w:asciiTheme="minorHAnsi" w:hAnsiTheme="minorHAnsi" w:cstheme="minorHAnsi"/>
+          <w:sz w:val="22"/>
+          <w:szCs w:val="22"/>
+        </w:rPr>
         <w:t xml:space="preserve"> tipe 1 (TF-IDF) dapat dilihat pada Tabel 3.3.</w:t>
-      </w:r>
-      <w:r>
-        <w:rPr>
-          <w:rFonts w:asciiTheme="minorHAnsi" w:hAnsiTheme="minorHAnsi" w:cstheme="minorHAnsi"/>
-          <w:sz w:val="22"/>
-          <w:szCs w:val="22"/>
-        </w:rPr>
-        <w:t xml:space="preserve"> </w:t>
       </w:r>
     </w:p>
     <w:p>
@@ -27576,7 +27858,16 @@
                 <w:sz w:val="18"/>
                 <w:szCs w:val="18"/>
               </w:rPr>
-              <w:t xml:space="preserve"> pepe klaim kilau grup telegram {LINK} kilau taut daftar {LINK} masuk klik promosi klik bonus masuk kode klik laku </w:t>
+              <w:t xml:space="preserve"> pepe klaim kilau grup telegram {LINK} kilau taut daftar {LINK} masuk klik promo klik bonus masuk kode klik terap</w:t>
+            </w:r>
+            <w:r>
+              <w:rPr>
+                <w:rFonts w:ascii="Calibri" w:hAnsi="Calibri" w:cs="Calibri"/>
+                <w:color w:val="000000"/>
+                <w:sz w:val="18"/>
+                <w:szCs w:val="18"/>
+              </w:rPr>
+              <w:t xml:space="preserve"> </w:t>
             </w:r>
           </w:p>
         </w:tc>
@@ -27751,7 +28042,7 @@
                 <w:sz w:val="18"/>
                 <w:szCs w:val="18"/>
               </w:rPr>
-              <w:t xml:space="preserve">api khusus sedia </w:t>
+              <w:t xml:space="preserve">api sedia </w:t>
             </w:r>
             <w:proofErr w:type="spellStart"/>
             <w:r>
@@ -27771,7 +28062,7 @@
                 <w:sz w:val="18"/>
                 <w:szCs w:val="18"/>
               </w:rPr>
-              <w:t xml:space="preserve"> hot </w:t>
+              <w:t xml:space="preserve"> panas khusus </w:t>
             </w:r>
             <w:proofErr w:type="spellStart"/>
             <w:r>
@@ -27791,7 +28082,7 @@
                 <w:sz w:val="18"/>
                 <w:szCs w:val="18"/>
               </w:rPr>
-              <w:t xml:space="preserve"> panen api modal ribu hasil juta tabrak nikmat utama main panen uang sayap </w:t>
+              <w:t xml:space="preserve"> panen api modal </w:t>
             </w:r>
             <w:proofErr w:type="spellStart"/>
             <w:r>
@@ -27801,7 +28092,7 @@
                 <w:sz w:val="18"/>
                 <w:szCs w:val="18"/>
               </w:rPr>
-              <w:t>link</w:t>
+              <w:t>rb</w:t>
             </w:r>
             <w:proofErr w:type="spellEnd"/>
             <w:r>
@@ -27811,7 +28102,7 @@
                 <w:sz w:val="18"/>
                 <w:szCs w:val="18"/>
               </w:rPr>
-              <w:t xml:space="preserve"> daftar {LINK} </w:t>
+              <w:t xml:space="preserve"> hasil juta tabrak nikmat uang main panen uang sayap taut daftar {LINK} </w:t>
             </w:r>
             <w:proofErr w:type="spellStart"/>
             <w:r>
@@ -28015,7 +28306,7 @@
                 <w:sz w:val="18"/>
                 <w:szCs w:val="18"/>
               </w:rPr>
-              <w:t xml:space="preserve"> gila </w:t>
+              <w:t xml:space="preserve"> keren </w:t>
             </w:r>
             <w:proofErr w:type="spellStart"/>
             <w:r>
@@ -28025,7 +28316,7 @@
                 <w:sz w:val="18"/>
                 <w:szCs w:val="18"/>
               </w:rPr>
-              <w:t>gila</w:t>
+              <w:t>mahaslot</w:t>
             </w:r>
             <w:proofErr w:type="spellEnd"/>
             <w:r>
@@ -28035,7 +28326,7 @@
                 <w:sz w:val="18"/>
                 <w:szCs w:val="18"/>
               </w:rPr>
-              <w:t xml:space="preserve"> </w:t>
+              <w:t xml:space="preserve"> royal </w:t>
             </w:r>
             <w:proofErr w:type="spellStart"/>
             <w:r>
@@ -28045,7 +28336,7 @@
                 <w:sz w:val="18"/>
                 <w:szCs w:val="18"/>
               </w:rPr>
-              <w:t>mahaslot</w:t>
+              <w:t>gan</w:t>
             </w:r>
             <w:proofErr w:type="spellEnd"/>
             <w:r>
@@ -28055,7 +28346,7 @@
                 <w:sz w:val="18"/>
                 <w:szCs w:val="18"/>
               </w:rPr>
-              <w:t xml:space="preserve"> royal </w:t>
+              <w:t xml:space="preserve"> kasih juta </w:t>
             </w:r>
             <w:proofErr w:type="spellStart"/>
             <w:r>
@@ -28065,7 +28356,7 @@
                 <w:sz w:val="18"/>
                 <w:szCs w:val="18"/>
               </w:rPr>
-              <w:t>bro</w:t>
+              <w:t>hahaha</w:t>
             </w:r>
             <w:proofErr w:type="spellEnd"/>
             <w:r>
@@ -28075,7 +28366,7 @@
                 <w:sz w:val="18"/>
                 <w:szCs w:val="18"/>
               </w:rPr>
-              <w:t xml:space="preserve"> juta kasih </w:t>
+              <w:t xml:space="preserve"> mantap </w:t>
             </w:r>
             <w:proofErr w:type="spellStart"/>
             <w:r>
@@ -28085,38 +28376,9 @@
                 <w:sz w:val="18"/>
                 <w:szCs w:val="18"/>
               </w:rPr>
-              <w:t>hahaha</w:t>
+              <w:t>mahaslot</w:t>
             </w:r>
             <w:proofErr w:type="spellEnd"/>
-            <w:r>
-              <w:rPr>
-                <w:rFonts w:ascii="Calibri" w:hAnsi="Calibri" w:cs="Calibri"/>
-                <w:color w:val="000000"/>
-                <w:sz w:val="18"/>
-                <w:szCs w:val="18"/>
-              </w:rPr>
-              <w:t xml:space="preserve"> mantap </w:t>
-            </w:r>
-            <w:proofErr w:type="spellStart"/>
-            <w:r>
-              <w:rPr>
-                <w:rFonts w:ascii="Calibri" w:hAnsi="Calibri" w:cs="Calibri"/>
-                <w:color w:val="000000"/>
-                <w:sz w:val="18"/>
-                <w:szCs w:val="18"/>
-              </w:rPr>
-              <w:t>mahaslot</w:t>
-            </w:r>
-            <w:proofErr w:type="spellEnd"/>
-            <w:r>
-              <w:rPr>
-                <w:rFonts w:ascii="Calibri" w:hAnsi="Calibri" w:cs="Calibri"/>
-                <w:color w:val="000000"/>
-                <w:sz w:val="18"/>
-                <w:szCs w:val="18"/>
-              </w:rPr>
-              <w:t xml:space="preserve"> </w:t>
-            </w:r>
           </w:p>
         </w:tc>
       </w:tr>
@@ -28149,7 +28411,7 @@
           <w:sz w:val="22"/>
           <w:szCs w:val="22"/>
         </w:rPr>
-        <w:t xml:space="preserve">Sementara itu, untuk model </w:t>
+        <w:t xml:space="preserve">Untuk model </w:t>
       </w:r>
       <w:proofErr w:type="spellStart"/>
       <w:r>
@@ -28185,7 +28447,97 @@
           <w:sz w:val="22"/>
           <w:szCs w:val="22"/>
         </w:rPr>
-        <w:t xml:space="preserve"> yang dilakukan bersifat lebih sederhana. Hal ini disebabkan karena </w:t>
+        <w:t xml:space="preserve"> dilakukan secara lebih sederhana karena model ini telah dilatih pada lebih dari 26 juta </w:t>
+      </w:r>
+      <w:proofErr w:type="spellStart"/>
+      <w:r>
+        <w:rPr>
+          <w:rFonts w:asciiTheme="minorHAnsi" w:hAnsiTheme="minorHAnsi" w:cstheme="minorHAnsi"/>
+          <w:sz w:val="22"/>
+          <w:szCs w:val="22"/>
+        </w:rPr>
+        <w:t>tweet</w:t>
+      </w:r>
+      <w:proofErr w:type="spellEnd"/>
+      <w:r>
+        <w:rPr>
+          <w:rFonts w:asciiTheme="minorHAnsi" w:hAnsiTheme="minorHAnsi" w:cstheme="minorHAnsi"/>
+          <w:sz w:val="22"/>
+          <w:szCs w:val="22"/>
+        </w:rPr>
+        <w:t xml:space="preserve"> berbahasa Indonesia dan mampu memahami bahasa informal, ejaan tidak baku, serta struktur khas media sosial. Oleh karena itu, tahap seperti </w:t>
+      </w:r>
+      <w:proofErr w:type="spellStart"/>
+      <w:r>
+        <w:rPr>
+          <w:rFonts w:asciiTheme="minorHAnsi" w:hAnsiTheme="minorHAnsi" w:cstheme="minorHAnsi"/>
+          <w:sz w:val="22"/>
+          <w:szCs w:val="22"/>
+        </w:rPr>
+        <w:t>stemming</w:t>
+      </w:r>
+      <w:proofErr w:type="spellEnd"/>
+      <w:r>
+        <w:rPr>
+          <w:rFonts w:asciiTheme="minorHAnsi" w:hAnsiTheme="minorHAnsi" w:cstheme="minorHAnsi"/>
+          <w:sz w:val="22"/>
+          <w:szCs w:val="22"/>
+        </w:rPr>
+        <w:t xml:space="preserve"> dan penghapusan </w:t>
+      </w:r>
+      <w:proofErr w:type="spellStart"/>
+      <w:r>
+        <w:rPr>
+          <w:rFonts w:asciiTheme="minorHAnsi" w:hAnsiTheme="minorHAnsi" w:cstheme="minorHAnsi"/>
+          <w:sz w:val="22"/>
+          <w:szCs w:val="22"/>
+        </w:rPr>
+        <w:t>stopwords</w:t>
+      </w:r>
+      <w:proofErr w:type="spellEnd"/>
+      <w:r>
+        <w:rPr>
+          <w:rFonts w:asciiTheme="minorHAnsi" w:hAnsiTheme="minorHAnsi" w:cstheme="minorHAnsi"/>
+          <w:sz w:val="22"/>
+          <w:szCs w:val="22"/>
+        </w:rPr>
+        <w:t xml:space="preserve"> tidak diperlukan, karena </w:t>
+      </w:r>
+      <w:proofErr w:type="spellStart"/>
+      <w:r>
+        <w:rPr>
+          <w:rFonts w:asciiTheme="minorHAnsi" w:hAnsiTheme="minorHAnsi" w:cstheme="minorHAnsi"/>
+          <w:sz w:val="22"/>
+          <w:szCs w:val="22"/>
+        </w:rPr>
+        <w:t>subword</w:t>
+      </w:r>
+      <w:proofErr w:type="spellEnd"/>
+      <w:r>
+        <w:rPr>
+          <w:rFonts w:asciiTheme="minorHAnsi" w:hAnsiTheme="minorHAnsi" w:cstheme="minorHAnsi"/>
+          <w:sz w:val="22"/>
+          <w:szCs w:val="22"/>
+        </w:rPr>
+        <w:t xml:space="preserve"> </w:t>
+      </w:r>
+      <w:proofErr w:type="spellStart"/>
+      <w:r>
+        <w:rPr>
+          <w:rFonts w:asciiTheme="minorHAnsi" w:hAnsiTheme="minorHAnsi" w:cstheme="minorHAnsi"/>
+          <w:sz w:val="22"/>
+          <w:szCs w:val="22"/>
+        </w:rPr>
+        <w:t>tokenizer</w:t>
+      </w:r>
+      <w:proofErr w:type="spellEnd"/>
+      <w:r>
+        <w:rPr>
+          <w:rFonts w:asciiTheme="minorHAnsi" w:hAnsiTheme="minorHAnsi" w:cstheme="minorHAnsi"/>
+          <w:sz w:val="22"/>
+          <w:szCs w:val="22"/>
+        </w:rPr>
+        <w:t xml:space="preserve"> </w:t>
       </w:r>
       <w:proofErr w:type="spellStart"/>
       <w:r>
@@ -28203,79 +28555,104 @@
           <w:sz w:val="22"/>
           <w:szCs w:val="22"/>
         </w:rPr>
-        <w:t xml:space="preserve"> merupakan model </w:t>
-      </w:r>
-      <w:proofErr w:type="spellStart"/>
-      <w:r>
-        <w:rPr>
-          <w:rFonts w:asciiTheme="minorHAnsi" w:hAnsiTheme="minorHAnsi" w:cstheme="minorHAnsi"/>
-          <w:sz w:val="22"/>
-          <w:szCs w:val="22"/>
-        </w:rPr>
-        <w:t>transformer</w:t>
-      </w:r>
-      <w:proofErr w:type="spellEnd"/>
-      <w:r>
-        <w:rPr>
-          <w:rFonts w:asciiTheme="minorHAnsi" w:hAnsiTheme="minorHAnsi" w:cstheme="minorHAnsi"/>
-          <w:sz w:val="22"/>
-          <w:szCs w:val="22"/>
-        </w:rPr>
-        <w:t xml:space="preserve"> yang telah dilatih menggunakan lebih dari 26 juta </w:t>
-      </w:r>
-      <w:proofErr w:type="spellStart"/>
-      <w:r>
-        <w:rPr>
-          <w:rFonts w:asciiTheme="minorHAnsi" w:hAnsiTheme="minorHAnsi" w:cstheme="minorHAnsi"/>
-          <w:sz w:val="22"/>
-          <w:szCs w:val="22"/>
-        </w:rPr>
-        <w:t>tweet</w:t>
-      </w:r>
-      <w:proofErr w:type="spellEnd"/>
-      <w:r>
-        <w:rPr>
-          <w:rFonts w:asciiTheme="minorHAnsi" w:hAnsiTheme="minorHAnsi" w:cstheme="minorHAnsi"/>
-          <w:sz w:val="22"/>
-          <w:szCs w:val="22"/>
-        </w:rPr>
-        <w:t xml:space="preserve"> berbahasa Indonesia dan memiliki kemampuan memahami variasi bahasa informal, ejaan tidak baku, serta struktur khas media sosial. Dengan demikian, tahap-tahap seperti </w:t>
-      </w:r>
-      <w:proofErr w:type="spellStart"/>
-      <w:r>
-        <w:rPr>
-          <w:rFonts w:asciiTheme="minorHAnsi" w:hAnsiTheme="minorHAnsi" w:cstheme="minorHAnsi"/>
-          <w:sz w:val="22"/>
-          <w:szCs w:val="22"/>
-        </w:rPr>
-        <w:t>stemming</w:t>
-      </w:r>
-      <w:proofErr w:type="spellEnd"/>
-      <w:r>
-        <w:rPr>
-          <w:rFonts w:asciiTheme="minorHAnsi" w:hAnsiTheme="minorHAnsi" w:cstheme="minorHAnsi"/>
-          <w:sz w:val="22"/>
-          <w:szCs w:val="22"/>
-        </w:rPr>
-        <w:t xml:space="preserve"> dan penghapusan </w:t>
-      </w:r>
-      <w:proofErr w:type="spellStart"/>
-      <w:r>
-        <w:rPr>
-          <w:rFonts w:asciiTheme="minorHAnsi" w:hAnsiTheme="minorHAnsi" w:cstheme="minorHAnsi"/>
-          <w:sz w:val="22"/>
-          <w:szCs w:val="22"/>
-        </w:rPr>
-        <w:t>stopwords</w:t>
-      </w:r>
-      <w:proofErr w:type="spellEnd"/>
-      <w:r>
-        <w:rPr>
-          <w:rFonts w:asciiTheme="minorHAnsi" w:hAnsiTheme="minorHAnsi" w:cstheme="minorHAnsi"/>
-          <w:sz w:val="22"/>
-          <w:szCs w:val="22"/>
-        </w:rPr>
-        <w:t xml:space="preserve"> tidak lagi diperlukan, karena </w:t>
+        <w:t xml:space="preserve"> sudah dapat menangani variasi bentuk kata secara kontekstual. Proses difokuskan pada pembersihan elemen non-linguistik seperti </w:t>
+      </w:r>
+      <w:proofErr w:type="spellStart"/>
+      <w:r>
+        <w:rPr>
+          <w:rFonts w:asciiTheme="minorHAnsi" w:hAnsiTheme="minorHAnsi" w:cstheme="minorHAnsi"/>
+          <w:sz w:val="22"/>
+          <w:szCs w:val="22"/>
+        </w:rPr>
+        <w:t>emoji</w:t>
+      </w:r>
+      <w:proofErr w:type="spellEnd"/>
+      <w:r>
+        <w:rPr>
+          <w:rFonts w:asciiTheme="minorHAnsi" w:hAnsiTheme="minorHAnsi" w:cstheme="minorHAnsi"/>
+          <w:sz w:val="22"/>
+          <w:szCs w:val="22"/>
+        </w:rPr>
+        <w:t>, tautan, angka, tanda baca, serta normalisasi teks dan spasi agar format lebih seragam. Setelah penghapusan duplikat, diperoleh 11.693 teks akhir yang terdiri dari 5.994 teks berlabel promosi (</w:t>
+      </w:r>
+      <w:proofErr w:type="spellStart"/>
+      <w:r>
+        <w:rPr>
+          <w:rFonts w:asciiTheme="minorHAnsi" w:hAnsiTheme="minorHAnsi" w:cstheme="minorHAnsi"/>
+          <w:sz w:val="22"/>
+          <w:szCs w:val="22"/>
+        </w:rPr>
+        <w:t>True</w:t>
+      </w:r>
+      <w:proofErr w:type="spellEnd"/>
+      <w:r>
+        <w:rPr>
+          <w:rFonts w:asciiTheme="minorHAnsi" w:hAnsiTheme="minorHAnsi" w:cstheme="minorHAnsi"/>
+          <w:sz w:val="22"/>
+          <w:szCs w:val="22"/>
+        </w:rPr>
+        <w:t xml:space="preserve">) dan 5.699 teks </w:t>
+      </w:r>
+      <w:r>
+        <w:rPr>
+          <w:rFonts w:asciiTheme="minorHAnsi" w:hAnsiTheme="minorHAnsi" w:cstheme="minorHAnsi"/>
+          <w:sz w:val="22"/>
+          <w:szCs w:val="22"/>
+        </w:rPr>
+        <w:lastRenderedPageBreak/>
+        <w:t>non-promosi (</w:t>
+      </w:r>
+      <w:proofErr w:type="spellStart"/>
+      <w:r>
+        <w:rPr>
+          <w:rFonts w:asciiTheme="minorHAnsi" w:hAnsiTheme="minorHAnsi" w:cstheme="minorHAnsi"/>
+          <w:sz w:val="22"/>
+          <w:szCs w:val="22"/>
+        </w:rPr>
+        <w:t>False</w:t>
+      </w:r>
+      <w:proofErr w:type="spellEnd"/>
+      <w:r>
+        <w:rPr>
+          <w:rFonts w:asciiTheme="minorHAnsi" w:hAnsiTheme="minorHAnsi" w:cstheme="minorHAnsi"/>
+          <w:sz w:val="22"/>
+          <w:szCs w:val="22"/>
+        </w:rPr>
+        <w:t xml:space="preserve">), dengan distribusi </w:t>
+      </w:r>
+      <w:r>
+        <w:rPr>
+          <w:rFonts w:asciiTheme="minorHAnsi" w:hAnsiTheme="minorHAnsi" w:cstheme="minorHAnsi"/>
+          <w:sz w:val="22"/>
+          <w:szCs w:val="22"/>
+        </w:rPr>
+        <w:t>antar kelas masih tergolong</w:t>
+      </w:r>
+      <w:r>
+        <w:rPr>
+          <w:rFonts w:asciiTheme="minorHAnsi" w:hAnsiTheme="minorHAnsi" w:cstheme="minorHAnsi"/>
+          <w:sz w:val="22"/>
+          <w:szCs w:val="22"/>
+        </w:rPr>
+        <w:t xml:space="preserve"> seimbang. Contoh hasil akhir teks setelah </w:t>
+      </w:r>
+      <w:proofErr w:type="spellStart"/>
+      <w:r>
+        <w:rPr>
+          <w:rFonts w:asciiTheme="minorHAnsi" w:hAnsiTheme="minorHAnsi" w:cstheme="minorHAnsi"/>
+          <w:sz w:val="22"/>
+          <w:szCs w:val="22"/>
+        </w:rPr>
+        <w:t>preprocessing</w:t>
+      </w:r>
+      <w:proofErr w:type="spellEnd"/>
+      <w:r>
+        <w:rPr>
+          <w:rFonts w:asciiTheme="minorHAnsi" w:hAnsiTheme="minorHAnsi" w:cstheme="minorHAnsi"/>
+          <w:sz w:val="22"/>
+          <w:szCs w:val="22"/>
+        </w:rPr>
+        <w:t xml:space="preserve"> tipe 2 (</w:t>
       </w:r>
       <w:proofErr w:type="spellStart"/>
       <w:r>
@@ -28293,159 +28670,15 @@
           <w:sz w:val="22"/>
           <w:szCs w:val="22"/>
         </w:rPr>
-        <w:t xml:space="preserve"> menggunakan </w:t>
-      </w:r>
-      <w:proofErr w:type="spellStart"/>
-      <w:r>
-        <w:rPr>
-          <w:rFonts w:asciiTheme="minorHAnsi" w:hAnsiTheme="minorHAnsi" w:cstheme="minorHAnsi"/>
-          <w:sz w:val="22"/>
-          <w:szCs w:val="22"/>
-        </w:rPr>
-        <w:t>subword</w:t>
-      </w:r>
-      <w:proofErr w:type="spellEnd"/>
-      <w:r>
-        <w:rPr>
-          <w:rFonts w:asciiTheme="minorHAnsi" w:hAnsiTheme="minorHAnsi" w:cstheme="minorHAnsi"/>
-          <w:sz w:val="22"/>
-          <w:szCs w:val="22"/>
-        </w:rPr>
-        <w:t xml:space="preserve"> </w:t>
-      </w:r>
-      <w:proofErr w:type="spellStart"/>
-      <w:r>
-        <w:rPr>
-          <w:rFonts w:asciiTheme="minorHAnsi" w:hAnsiTheme="minorHAnsi" w:cstheme="minorHAnsi"/>
-          <w:sz w:val="22"/>
-          <w:szCs w:val="22"/>
-        </w:rPr>
-        <w:t>tokenizer</w:t>
-      </w:r>
-      <w:proofErr w:type="spellEnd"/>
-      <w:r>
-        <w:rPr>
-          <w:rFonts w:asciiTheme="minorHAnsi" w:hAnsiTheme="minorHAnsi" w:cstheme="minorHAnsi"/>
-          <w:sz w:val="22"/>
-          <w:szCs w:val="22"/>
-        </w:rPr>
-        <w:t xml:space="preserve"> yang dapat menangani variasi bentuk kata secara kontekstual. </w:t>
-      </w:r>
-      <w:proofErr w:type="spellStart"/>
-      <w:r>
-        <w:rPr>
-          <w:rFonts w:asciiTheme="minorHAnsi" w:hAnsiTheme="minorHAnsi" w:cstheme="minorHAnsi"/>
-          <w:sz w:val="22"/>
-          <w:szCs w:val="22"/>
-        </w:rPr>
-        <w:t>Preprocessing</w:t>
-      </w:r>
-      <w:proofErr w:type="spellEnd"/>
-      <w:r>
-        <w:rPr>
-          <w:rFonts w:asciiTheme="minorHAnsi" w:hAnsiTheme="minorHAnsi" w:cstheme="minorHAnsi"/>
-          <w:sz w:val="22"/>
-          <w:szCs w:val="22"/>
-        </w:rPr>
-        <w:t xml:space="preserve"> untuk model ini difokuskan pada pembersihan teks dari elemen-elemen non-linguistik seperti </w:t>
-      </w:r>
-      <w:proofErr w:type="spellStart"/>
-      <w:r>
-        <w:rPr>
-          <w:rFonts w:asciiTheme="minorHAnsi" w:hAnsiTheme="minorHAnsi" w:cstheme="minorHAnsi"/>
-          <w:sz w:val="22"/>
-          <w:szCs w:val="22"/>
-        </w:rPr>
-        <w:t>emoji</w:t>
-      </w:r>
-      <w:proofErr w:type="spellEnd"/>
-      <w:r>
-        <w:rPr>
-          <w:rFonts w:asciiTheme="minorHAnsi" w:hAnsiTheme="minorHAnsi" w:cstheme="minorHAnsi"/>
-          <w:sz w:val="22"/>
-          <w:szCs w:val="22"/>
-        </w:rPr>
-        <w:t xml:space="preserve">, tautan, angka, dan tanda baca yang dapat mengganggu pemrosesan </w:t>
-      </w:r>
-      <w:proofErr w:type="spellStart"/>
-      <w:r>
-        <w:rPr>
-          <w:rFonts w:asciiTheme="minorHAnsi" w:hAnsiTheme="minorHAnsi" w:cstheme="minorHAnsi"/>
-          <w:sz w:val="22"/>
-          <w:szCs w:val="22"/>
-        </w:rPr>
-        <w:t>token</w:t>
-      </w:r>
-      <w:proofErr w:type="spellEnd"/>
-      <w:r>
-        <w:rPr>
-          <w:rFonts w:asciiTheme="minorHAnsi" w:hAnsiTheme="minorHAnsi" w:cstheme="minorHAnsi"/>
-          <w:sz w:val="22"/>
-          <w:szCs w:val="22"/>
-        </w:rPr>
-        <w:t xml:space="preserve">. Selain itu, dilakukan normalisasi teks dan spasi agar format teks lebih seragam. </w:t>
-      </w:r>
-      <w:r>
-        <w:rPr>
-          <w:rFonts w:asciiTheme="minorHAnsi" w:hAnsiTheme="minorHAnsi" w:cstheme="minorHAnsi"/>
-          <w:sz w:val="22"/>
-          <w:szCs w:val="22"/>
-        </w:rPr>
-        <w:t xml:space="preserve">Hasil akhir dari tahap </w:t>
-      </w:r>
-      <w:proofErr w:type="spellStart"/>
-      <w:r>
-        <w:rPr>
-          <w:rFonts w:asciiTheme="minorHAnsi" w:hAnsiTheme="minorHAnsi" w:cstheme="minorHAnsi"/>
-          <w:sz w:val="22"/>
-          <w:szCs w:val="22"/>
-        </w:rPr>
-        <w:t>preprocessing</w:t>
-      </w:r>
-      <w:proofErr w:type="spellEnd"/>
-      <w:r>
-        <w:rPr>
-          <w:rFonts w:asciiTheme="minorHAnsi" w:hAnsiTheme="minorHAnsi" w:cstheme="minorHAnsi"/>
-          <w:sz w:val="22"/>
-          <w:szCs w:val="22"/>
-        </w:rPr>
-        <w:t xml:space="preserve"> ini berupa teks bersih dan rapi, namun tetap mempertahankan struktur alami bahasa sebagaimana ditemukan di media sosial. Contoh hasil akhir teks setelah </w:t>
-      </w:r>
-      <w:proofErr w:type="spellStart"/>
-      <w:r>
-        <w:rPr>
-          <w:rFonts w:asciiTheme="minorHAnsi" w:hAnsiTheme="minorHAnsi" w:cstheme="minorHAnsi"/>
-          <w:sz w:val="22"/>
-          <w:szCs w:val="22"/>
-        </w:rPr>
-        <w:t>preprocessing</w:t>
-      </w:r>
-      <w:proofErr w:type="spellEnd"/>
-      <w:r>
-        <w:rPr>
-          <w:rFonts w:asciiTheme="minorHAnsi" w:hAnsiTheme="minorHAnsi" w:cstheme="minorHAnsi"/>
-          <w:sz w:val="22"/>
-          <w:szCs w:val="22"/>
-        </w:rPr>
-        <w:t xml:space="preserve"> tipe 2 (</w:t>
-      </w:r>
-      <w:proofErr w:type="spellStart"/>
-      <w:r>
-        <w:rPr>
-          <w:rFonts w:asciiTheme="minorHAnsi" w:hAnsiTheme="minorHAnsi" w:cstheme="minorHAnsi"/>
-          <w:sz w:val="22"/>
-          <w:szCs w:val="22"/>
-        </w:rPr>
-        <w:t>IndoBERTweet</w:t>
-      </w:r>
-      <w:proofErr w:type="spellEnd"/>
-      <w:r>
-        <w:rPr>
-          <w:rFonts w:asciiTheme="minorHAnsi" w:hAnsiTheme="minorHAnsi" w:cstheme="minorHAnsi"/>
-          <w:sz w:val="22"/>
-          <w:szCs w:val="22"/>
-        </w:rPr>
-        <w:t>) ditunjukkan pada Tabel 3.4.</w:t>
+        <w:t>) ditunjukkan pada Tabel 3.4</w:t>
+      </w:r>
+      <w:r>
+        <w:rPr>
+          <w:rFonts w:asciiTheme="minorHAnsi" w:hAnsiTheme="minorHAnsi" w:cstheme="minorHAnsi"/>
+          <w:sz w:val="22"/>
+          <w:szCs w:val="22"/>
+        </w:rPr>
+        <w:t>.</w:t>
       </w:r>
       <w:r>
         <w:rPr>
@@ -28936,7 +29169,6 @@
                 <w:szCs w:val="18"/>
                 <w:lang w:val="en-ID"/>
               </w:rPr>
-              <w:lastRenderedPageBreak/>
               <w:t>groupfreebet</w:t>
             </w:r>
             <w:proofErr w:type="spellEnd"/>
@@ -29158,7 +29390,6 @@
                 <w:sz w:val="18"/>
                 <w:szCs w:val="18"/>
               </w:rPr>
-              <w:lastRenderedPageBreak/>
               <w:t>wajah_materialistis</w:t>
             </w:r>
             <w:proofErr w:type="spellEnd"/>
@@ -29239,7 +29470,6 @@
                 <w:sz w:val="18"/>
                 <w:szCs w:val="18"/>
               </w:rPr>
-              <w:lastRenderedPageBreak/>
               <w:t>menunjuk_ke_bawah</w:t>
             </w:r>
             <w:proofErr w:type="spellEnd"/>
@@ -29398,7 +29628,6 @@
                 <w:szCs w:val="18"/>
                 <w:lang w:val="en-ID"/>
               </w:rPr>
-              <w:lastRenderedPageBreak/>
               <w:t>🔥</w:t>
             </w:r>
             <w:r>
@@ -30550,6 +30779,7 @@
           <w:sz w:val="22"/>
           <w:szCs w:val="22"/>
         </w:rPr>
+        <w:lastRenderedPageBreak/>
         <w:t>Frequency</w:t>
       </w:r>
       <w:proofErr w:type="spellEnd"/>
@@ -30615,7 +30845,6 @@
           <w:sz w:val="22"/>
           <w:szCs w:val="22"/>
         </w:rPr>
-        <w:lastRenderedPageBreak/>
         <w:t xml:space="preserve">Untuk proses klasifikasi, digunakan algoritma </w:t>
       </w:r>
       <w:proofErr w:type="spellStart"/>
@@ -31555,6 +31784,7 @@
           <w:sz w:val="22"/>
           <w:szCs w:val="22"/>
         </w:rPr>
+        <w:lastRenderedPageBreak/>
         <w:t xml:space="preserve">Pendekatan ini menggabungkan kekuatan representasi kontekstual dari </w:t>
       </w:r>
       <w:proofErr w:type="spellStart"/>
@@ -31674,7 +31904,6 @@
           <w:noProof/>
           <w14:ligatures w14:val="standardContextual"/>
         </w:rPr>
-        <w:lastRenderedPageBreak/>
         <w:drawing>
           <wp:inline distT="0" distB="0" distL="0" distR="0" wp14:anchorId="45DC9975" wp14:editId="04D1FCEA">
             <wp:extent cx="5400040" cy="1613535"/>
@@ -32346,6 +32575,7 @@
           <w:noProof/>
           <w14:ligatures w14:val="standardContextual"/>
         </w:rPr>
+        <w:lastRenderedPageBreak/>
         <w:drawing>
           <wp:inline distT="0" distB="0" distL="0" distR="0" wp14:anchorId="77759669" wp14:editId="66F998E3">
             <wp:extent cx="4863370" cy="1717964"/>
@@ -32536,7 +32766,6 @@
           <w:sz w:val="22"/>
           <w:szCs w:val="22"/>
         </w:rPr>
-        <w:lastRenderedPageBreak/>
         <w:t xml:space="preserve">Gambar </w:t>
       </w:r>
       <w:r>
@@ -33273,6 +33502,7 @@
           <w:sz w:val="22"/>
           <w:szCs w:val="22"/>
         </w:rPr>
+        <w:lastRenderedPageBreak/>
         <w:t xml:space="preserve">Gambar </w:t>
       </w:r>
       <w:r>
@@ -33451,7 +33681,6 @@
           <w:sz w:val="22"/>
           <w:szCs w:val="22"/>
         </w:rPr>
-        <w:lastRenderedPageBreak/>
         <w:t xml:space="preserve">Proses dimulai dengan </w:t>
       </w:r>
       <w:proofErr w:type="spellStart"/>

</xml_diff>